<commit_message>
Harden prelaunch checks and prepare standalone server deployment
</commit_message>
<xml_diff>
--- a/docs/微控制器个性化实践教学平台建设与验证报告.docx
+++ b/docs/微控制器个性化实践教学平台建设与验证报告.docx
@@ -14,7 +14,7 @@
           <w:color w:val="174C3D"/>
           <w:sz w:val="48"/>
         </w:rPr>
-        <w:t>微控制器个性化实践教学平台建设与验证报告</w:t>
+        <w:t>虚拟工程师平台建设与验证报告</w:t>
       </w:r>
     </w:p>
     <w:p>
@@ -48,7 +48,7 @@
           <w:rFonts w:ascii="PingFang SC" w:hAnsi="PingFang SC"/>
           <w:sz w:val="22"/>
         </w:rPr>
-        <w:t>项目阶段：课堂试用准备与验证</w:t>
+        <w:t>项目阶段：正式上线前功能与材料核验</w:t>
       </w:r>
     </w:p>
     <w:p>
@@ -60,7 +60,7 @@
           <w:rFonts w:ascii="PingFang SC" w:hAnsi="PingFang SC"/>
           <w:sz w:val="22"/>
         </w:rPr>
-        <w:t>报告日期：2026年9月20日</w:t>
+        <w:t>报告日期：2026年9月25日</w:t>
       </w:r>
     </w:p>
     <w:p>
@@ -464,14 +464,15 @@
             <w:pPr>
               <w:spacing w:after="0"/>
             </w:pPr>
-            <w:r/>
+            <w:r>
+              <w:t>已实现记录框架，教师确认问题可统计；无真实测评时不输出掌握率</w:t>
+            </w:r>
             <w:r>
               <w:rPr>
                 <w:rFonts w:ascii="PingFang SC" w:hAnsi="PingFang SC" w:eastAsia="PingFang SC"/>
                 <w:b w:val="0"/>
                 <w:sz w:val="18"/>
               </w:rPr>
-              <w:t>已实现记录框架；掌握度结论待真实测评</w:t>
             </w:r>
           </w:p>
         </w:tc>
@@ -526,14 +527,15 @@
             <w:pPr>
               <w:spacing w:after="0"/>
             </w:pPr>
-            <w:r/>
+            <w:r>
+              <w:t>6件交互式原理课件已建成；真实课堂案例、教学视频和成效数据待补</w:t>
+            </w:r>
             <w:r>
               <w:rPr>
                 <w:rFonts w:ascii="PingFang SC" w:hAnsi="PingFang SC" w:eastAsia="PingFang SC"/>
                 <w:b w:val="0"/>
                 <w:sz w:val="18"/>
               </w:rPr>
-              <w:t>尚未完成全量建设，列为下一阶段</w:t>
             </w:r>
           </w:p>
         </w:tc>
@@ -554,7 +556,7 @@
     </w:p>
     <w:p>
       <w:r>
-        <w:t>平台由学生工作区、教师工作台、知识图谱与诊疗参考、任务与评价、统计与导出五部分组成。当前课堂试用版将范围收敛到“中断不触发、串口乱码、定时不准”三类典型故障，既覆盖寄存器配置、时序计算和通信参数等关键知识点，也便于在实际课堂中形成可复核的故障—假设—验证—修订记录。</w:t>
+        <w:t>平台由按原报告顺序组织的八个实验指导、教师工作台、知识图谱约束诊疗、三级任务与评价、课堂统计及六件交互式原理课件组成。八项实验均可在学生端编译并运行8051汇编，观察机器状态；另将模型辅助诊疗限定为“中断不触发、串口乱码、定时不准”三类典型故障。八项实验指导不等于八项故障均已自动诊疗，六件原理课件也不等于六次真实实验。</w:t>
       </w:r>
     </w:p>
     <w:p>
@@ -603,6 +605,18 @@
       </w:r>
     </w:p>
     <w:p>
+      <w:pPr/>
+      <w:r>
+        <w:t>资料归属：原始八实验报告可供已登录师生下载；教师可按班级和实验上传图片、说明书、PPT及报告，核对后发布。实验八报告中的“四线双极型电机＋ULN2003”表述与普中手册的两套驱动连接不一致，尚需本班设备清单或接线照片确定物理映射。</w:t>
+      </w:r>
+    </w:p>
+    <w:p>
+      <w:pPr/>
+      <w:r>
+        <w:t>8051虚拟调试：学生代码由AS31汇编为Intel HEX，再由SDCC ucSim/s51运行机器码。实验五校正版可解码0—7八位扫描；实验六可比较两段蜂鸣器控制脚节奏；实验七历史时钟从Keil列表文件恢复，重编译的183字节与留存HEX逐地址一致，扩展示例可观察跨分钟显示与报警；实验八可比较30%/70%控制脚采样及八状态抽象相序。这些是数字信号层结果，不代表数码管光学、蜂鸣器声音、电机机械响应或本班接线已获实物验证。</w:t>
+      </w:r>
+    </w:p>
+    <w:p>
       <w:pPr>
         <w:pStyle w:val="Heading1"/>
       </w:pPr>
@@ -628,7 +642,7 @@
         <w:pStyle w:val="Heading2"/>
       </w:pPr>
       <w:r>
-        <w:t>（二）学生加入与诊疗</w:t>
+        <w:t>学生凭班级码、匿名编号和私密恢复码进入工作区，按实验一至八查看目标、准备、程序运行及验证要求。学生可选用真实汇编与虚拟调试；遇到问题时，只须描述实际现象，代码为可选补充。八实验求助生成教师待复核检查草稿；三类故障专项才调用图谱约束模型。提交后页面只显示单号和受理状态。</w:t>
       </w:r>
     </w:p>
     <w:p>
@@ -685,7 +699,7 @@
     </w:p>
     <w:p>
       <w:r>
-        <w:t>平台使用生成式人工智能完成检索辅助、诊疗初稿和代码初评，模型不直接替代教师判断。当前配置采用用户指定的 GLM-4.7-Flash 接口；本报告不记录密钥。真实课堂启用前，须由教师确认芯片、晶振、分频和实验目标，参数不足时只给出定性排查，不自行猜值。</w:t>
+        <w:t>平台将课程范围判断、图谱检索、程序计算、模型初稿和教师复核分开。当前环境配置为 GLM-4.7-Flash；密钥不写入报告。2026年9月25日无学生信息的最小连通性请求取得回复，但三类典型故障的真实模型输出未通过严格内容校验，后续请求还出现服务端429繁忙。不能认定自动诊疗稳定可用；接口失败时记录转入教师人工待办。真实课堂启用前，还须确认供应商数据处理条件、芯片、晶振、分频和实验目标。</w:t>
       </w:r>
     </w:p>
     <w:tbl>
@@ -1099,7 +1113,7 @@
     </w:p>
     <w:p>
       <w:r>
-        <w:t>本节记录的是当前平台代码和课堂试用流程的验证结果。结果分为功能验证、工程验证和模型/课堂边界三类，不能替代真实课堂成效报告。</w:t>
+        <w:t>本节仅记录平台工程、模拟流程、数字信号及公开入口的核验，不代替真实课堂或硬件实测。</w:t>
       </w:r>
     </w:p>
     <w:tbl>
@@ -1229,17 +1243,8 @@
             <w:vAlign w:val="center"/>
           </w:tcPr>
           <w:p>
-            <w:pPr>
-              <w:spacing w:after="0"/>
-            </w:pPr>
-            <w:r/>
             <w:r>
-              <w:rPr>
-                <w:rFonts w:ascii="PingFang SC" w:hAnsi="PingFang SC" w:eastAsia="PingFang SC"/>
-                <w:b w:val="0"/>
-                <w:sz w:val="18"/>
-              </w:rPr>
-              <w:t>31项单元测试、27组集成流程通过；覆盖权限、发布门禁、版本冲突、幂等和统计分母</w:t>
+              <w:t>59项单元测试、34组隔离数据库接口流程通过；含12项真实AS31/s51工具链检查。测试模型为本地假服务，不计为真实GLM验收。</w:t>
             </w:r>
           </w:p>
         </w:tc>
@@ -1294,14 +1299,15 @@
             <w:pPr>
               <w:spacing w:after="0"/>
             </w:pPr>
-            <w:r/>
+            <w:r>
+              <w:t>SQLite在线备份并恢复到独立副本：教师1、班级3、诊疗10、复核5、资料28，完整性与外键检查均通过；备份仍在本机，离机保管待落实。</w:t>
+            </w:r>
             <w:r>
               <w:rPr>
                 <w:rFonts w:ascii="PingFang SC" w:hAnsi="PingFang SC" w:eastAsia="PingFang SC"/>
                 <w:b w:val="0"/>
                 <w:sz w:val="18"/>
               </w:rPr>
-              <w:t>备份恢复后保留原有7条诊疗、5条复核、2条易错点记录；原文与关联关系保留</w:t>
             </w:r>
           </w:p>
         </w:tc>
@@ -1353,17 +1359,8 @@
             <w:vAlign w:val="center"/>
           </w:tcPr>
           <w:p>
-            <w:pPr>
-              <w:spacing w:after="0"/>
-            </w:pPr>
-            <w:r/>
             <w:r>
-              <w:rPr>
-                <w:rFonts w:ascii="PingFang SC" w:hAnsi="PingFang SC" w:eastAsia="PingFang SC"/>
-                <w:b w:val="0"/>
-                <w:sz w:val="18"/>
-              </w:rPr>
-              <w:t>40个独立会话读取无失败；p50约67 ms、p95约102 ms、最大约103 ms；为本地读取路径基线，不代表真实模型吞吐</w:t>
+              <w:t>40个独立已认证会话读取接口，0失败；P50 200ms、P95 310ms、最大313ms。只覆盖本机读取路径，模型使用假服务。</w:t>
             </w:r>
           </w:p>
         </w:tc>
@@ -1418,14 +1415,15 @@
             <w:pPr>
               <w:spacing w:after="0"/>
             </w:pPr>
-            <w:r/>
+            <w:r>
+              <w:t>生产构建、类型、零警告ESLint和图谱6项检查通过；公网学生页实验五运行50万条后解码0—7。390px调试页未出现整体横向溢出。</w:t>
+            </w:r>
             <w:r>
               <w:rPr>
                 <w:rFonts w:ascii="PingFang SC" w:hAnsi="PingFang SC" w:eastAsia="PingFang SC"/>
                 <w:b w:val="0"/>
                 <w:sz w:val="18"/>
               </w:rPr>
-              <w:t>生产构建通过，页面HTTP 200；已检查390、768、1440像素布局和键盘焦点</w:t>
             </w:r>
           </w:p>
         </w:tc>
@@ -1457,17 +1455,8 @@
             <w:vAlign w:val="center"/>
           </w:tcPr>
           <w:p>
-            <w:pPr>
-              <w:spacing w:after="0"/>
-            </w:pPr>
-            <w:r/>
             <w:r>
-              <w:rPr>
-                <w:rFonts w:ascii="PingFang SC" w:hAnsi="PingFang SC" w:eastAsia="PingFang SC"/>
-                <w:b w:val="0"/>
-                <w:sz w:val="18"/>
-              </w:rPr>
-              <w:t>未通过本轮外部验证</w:t>
+              <w:t>外部模型输出未通过</w:t>
             </w:r>
           </w:p>
         </w:tc>
@@ -1477,17 +1466,8 @@
             <w:vAlign w:val="center"/>
           </w:tcPr>
           <w:p>
-            <w:pPr>
-              <w:spacing w:after="0"/>
-            </w:pPr>
-            <w:r/>
             <w:r>
-              <w:rPr>
-                <w:rFonts w:ascii="PingFang SC" w:hAnsi="PingFang SC" w:eastAsia="PingFang SC"/>
-                <w:b w:val="0"/>
-                <w:sz w:val="18"/>
-              </w:rPr>
-              <w:t>GLM-4.7-Flash测试返回429“当前访问量过大”；因此不宣称真实模型稳定性或课堂生成效果</w:t>
+              <w:t>GLM-4.7-Flash最小连通性请求有回复；三类合成故障复测中，一次输出含无依据的数值结论，后两次返回429繁忙。平台拦截不合格输出并转教师人工待办。</w:t>
             </w:r>
           </w:p>
         </w:tc>
@@ -1542,14 +1522,15 @@
             <w:pPr>
               <w:spacing w:after="0"/>
             </w:pPr>
-            <w:r/>
+            <w:r>
+              <w:t>尚无真实课堂参与、对照班完成率、反馈周期或学生反馈数据；演示与历史记录均不写成课堂成效。</w:t>
+            </w:r>
             <w:r>
               <w:rPr>
                 <w:rFonts w:ascii="PingFang SC" w:hAnsi="PingFang SC" w:eastAsia="PingFang SC"/>
                 <w:b w:val="0"/>
                 <w:sz w:val="18"/>
               </w:rPr>
-              <w:t>尚无真实班级参与数、对照班完成率、反馈周期、学生反馈和教师复核一致率，不写成已取得成效</w:t>
             </w:r>
           </w:p>
         </w:tc>
@@ -1698,17 +1679,19 @@
             <w:vAlign w:val="center"/>
           </w:tcPr>
           <w:p>
-            <w:pPr>
-              <w:spacing w:after="0"/>
-            </w:pPr>
-            <w:r/>
             <w:r>
-              <w:rPr>
-                <w:rFonts w:ascii="PingFang SC" w:hAnsi="PingFang SC" w:eastAsia="PingFang SC"/>
-                <w:b w:val="0"/>
-                <w:sz w:val="18"/>
-              </w:rPr>
-              <w:t>中断不触发、串口乱码、定时不准的模板与流程</w:t>
+              <w:t>三类故障模板、图谱检索及教师复核接口通过隔离测试；真实模型输出尚未通过严格校验</w:t>
+            </w:r>
+          </w:p>
+        </w:tc>
+        <w:tc>
+          <w:tcPr>
+            <w:tcW w:type="dxa" w:w="2394"/>
+            <w:vAlign w:val="center"/>
+          </w:tcPr>
+          <w:p>
+            <w:r>
+              <w:t>教师人工复核试用可进行；自动诊疗可用性待验证</w:t>
             </w:r>
           </w:p>
         </w:tc>
@@ -1721,34 +1704,15 @@
             <w:pPr>
               <w:spacing w:after="0"/>
             </w:pPr>
-            <w:r/>
+            <w:r>
+              <w:t>以无学生信息的三类样例重试模型；教师确认芯片、晶振、量规及验证办法</w:t>
+            </w:r>
             <w:r>
               <w:rPr>
                 <w:rFonts w:ascii="PingFang SC" w:hAnsi="PingFang SC" w:eastAsia="PingFang SC"/>
                 <w:b w:val="0"/>
                 <w:sz w:val="18"/>
               </w:rPr>
-              <w:t>已具备试用条件</w:t>
-            </w:r>
-          </w:p>
-        </w:tc>
-        <w:tc>
-          <w:tcPr>
-            <w:tcW w:type="dxa" w:w="2394"/>
-            <w:vAlign w:val="center"/>
-          </w:tcPr>
-          <w:p>
-            <w:pPr>
-              <w:spacing w:after="0"/>
-            </w:pPr>
-            <w:r/>
-            <w:r>
-              <w:rPr>
-                <w:rFonts w:ascii="PingFang SC" w:hAnsi="PingFang SC" w:eastAsia="PingFang SC"/>
-                <w:b w:val="0"/>
-                <w:sz w:val="18"/>
-              </w:rPr>
-              <w:t>教师确认硬件参数和验证办法</w:t>
             </w:r>
           </w:p>
         </w:tc>
@@ -1783,14 +1747,15 @@
             <w:pPr>
               <w:spacing w:after="0"/>
             </w:pPr>
-            <w:r/>
+            <w:r>
+              <w:t>平台具备七要素字段及案例导出；未形成真实课堂成件</w:t>
+            </w:r>
             <w:r>
               <w:rPr>
                 <w:rFonts w:ascii="PingFang SC" w:hAnsi="PingFang SC" w:eastAsia="PingFang SC"/>
                 <w:b w:val="0"/>
                 <w:sz w:val="18"/>
               </w:rPr>
-              <w:t>平台可记录七要素字段，但尚未形成真实课堂成件</w:t>
             </w:r>
           </w:p>
         </w:tc>
@@ -1865,14 +1830,15 @@
             <w:pPr>
               <w:spacing w:after="0"/>
             </w:pPr>
-            <w:r/>
+            <w:r>
+              <w:t>6件独立交互页面已建成并可打开</w:t>
+            </w:r>
             <w:r>
               <w:rPr>
                 <w:rFonts w:ascii="PingFang SC" w:hAnsi="PingFang SC" w:eastAsia="PingFang SC"/>
                 <w:b w:val="0"/>
                 <w:sz w:val="18"/>
               </w:rPr>
-              <w:t>已有寄存器提示卡与图谱参考，不足6件独立课件</w:t>
             </w:r>
           </w:p>
         </w:tc>
@@ -1885,14 +1851,15 @@
             <w:pPr>
               <w:spacing w:after="0"/>
             </w:pPr>
-            <w:r/>
+            <w:r>
+              <w:t>建设目标中的数量已达到；教师内容审定待补</w:t>
+            </w:r>
             <w:r>
               <w:rPr>
                 <w:rFonts w:ascii="PingFang SC" w:hAnsi="PingFang SC" w:eastAsia="PingFang SC"/>
                 <w:b w:val="0"/>
                 <w:sz w:val="18"/>
               </w:rPr>
-              <w:t>未完成</w:t>
             </w:r>
           </w:p>
         </w:tc>
@@ -1905,14 +1872,15 @@
             <w:pPr>
               <w:spacing w:after="0"/>
             </w:pPr>
-            <w:r/>
+            <w:r>
+              <w:t>逐件核对原理、实验设备、参数边界及发布版本</w:t>
+            </w:r>
             <w:r>
               <w:rPr>
                 <w:rFonts w:ascii="PingFang SC" w:hAnsi="PingFang SC" w:eastAsia="PingFang SC"/>
                 <w:b w:val="0"/>
                 <w:sz w:val="18"/>
               </w:rPr>
-              <w:t>按知识点、故障、验证和复盘补齐课件并登记版本</w:t>
             </w:r>
           </w:p>
         </w:tc>
@@ -2029,14 +1997,15 @@
             <w:pPr>
               <w:spacing w:after="0"/>
             </w:pPr>
-            <w:r/>
+            <w:r>
+              <w:t>本报告已更新平台建设与验证事实；真实教学成效尚无数据</w:t>
+            </w:r>
             <w:r>
               <w:rPr>
                 <w:rFonts w:ascii="PingFang SC" w:hAnsi="PingFang SC" w:eastAsia="PingFang SC"/>
                 <w:b w:val="0"/>
                 <w:sz w:val="18"/>
               </w:rPr>
-              <w:t>本报告已覆盖平台、使用和验证；真实成效章节需课堂数据后更新</w:t>
             </w:r>
           </w:p>
         </w:tc>
@@ -2049,14 +2018,15 @@
             <w:pPr>
               <w:spacing w:after="0"/>
             </w:pPr>
-            <w:r/>
+            <w:r>
+              <w:t>建设与验证报告已更新；结项总结待真实课堂补证</w:t>
+            </w:r>
             <w:r>
               <w:rPr>
                 <w:rFonts w:ascii="PingFang SC" w:hAnsi="PingFang SC" w:eastAsia="PingFang SC"/>
                 <w:b w:val="0"/>
                 <w:sz w:val="18"/>
               </w:rPr>
-              <w:t>报告框架完成</w:t>
             </w:r>
           </w:p>
         </w:tc>
@@ -2069,14 +2039,15 @@
             <w:pPr>
               <w:spacing w:after="0"/>
             </w:pPr>
-            <w:r/>
+            <w:r>
+              <w:t>课堂试用后补入经核对的参与、完成、反馈及教师复核数据</w:t>
+            </w:r>
             <w:r>
               <w:rPr>
                 <w:rFonts w:ascii="PingFang SC" w:hAnsi="PingFang SC" w:eastAsia="PingFang SC"/>
                 <w:b w:val="0"/>
                 <w:sz w:val="18"/>
               </w:rPr>
-              <w:t>补入经核对的课堂统计与学生反馈</w:t>
             </w:r>
           </w:p>
         </w:tc>
@@ -2108,17 +2079,8 @@
             <w:vAlign w:val="center"/>
           </w:tcPr>
           <w:p>
-            <w:pPr>
-              <w:spacing w:after="0"/>
-            </w:pPr>
-            <w:r/>
             <w:r>
-              <w:rPr>
-                <w:rFonts w:ascii="PingFang SC" w:hAnsi="PingFang SC" w:eastAsia="PingFang SC"/>
-                <w:b w:val="0"/>
-                <w:sz w:val="18"/>
-              </w:rPr>
-              <w:t>已提供GLM配置入口和密钥外置；本轮模型调用受429影响</w:t>
+              <w:t>GLM配置外置、人工处理回退已实现；三类真实模型复测未通过；当前公网仍由本机Cloudflare Tunnel提供</w:t>
             </w:r>
           </w:p>
         </w:tc>
@@ -2128,17 +2090,8 @@
             <w:vAlign w:val="center"/>
           </w:tcPr>
           <w:p>
-            <w:pPr>
-              <w:spacing w:after="0"/>
-            </w:pPr>
-            <w:r/>
             <w:r>
-              <w:rPr>
-                <w:rFonts w:ascii="PingFang SC" w:hAnsi="PingFang SC" w:eastAsia="PingFang SC"/>
-                <w:b w:val="0"/>
-                <w:sz w:val="18"/>
-              </w:rPr>
-              <w:t>技术路径具备，运行效果待验证</w:t>
+              <w:t>模型稳定性、数据处理条件与独立服务器上线待核实</w:t>
             </w:r>
           </w:p>
         </w:tc>
@@ -2148,17 +2101,8 @@
             <w:vAlign w:val="center"/>
           </w:tcPr>
           <w:p>
-            <w:pPr>
-              <w:spacing w:after="0"/>
-            </w:pPr>
-            <w:r/>
             <w:r>
-              <w:rPr>
-                <w:rFonts w:ascii="PingFang SC" w:hAnsi="PingFang SC" w:eastAsia="PingFang SC"/>
-                <w:b w:val="0"/>
-                <w:sz w:val="18"/>
-              </w:rPr>
-              <w:t>按部署位置和学院审查形式补记录</w:t>
+              <w:t>在独立常开服务器恢复数据库并复测；确认学校模型与数据要求，完成三类故障的供应商可用性验证</w:t>
             </w:r>
           </w:p>
         </w:tc>
@@ -2183,7 +2127,7 @@
         <w:spacing w:after="60"/>
       </w:pPr>
       <w:r>
-        <w:t>真实教学效果尚未形成证据：不得把演示记录、测试记录、提交数量或模型初稿数量解释为参与人数、完成率或掌握率。</w:t>
+        <w:t>真实教学效果尚无证据：现有10条诊疗中7条归为历史待核实、3条为演示；不得把这些记录解释为实际参与人数、完成率或掌握率。</w:t>
       </w:r>
     </w:p>
     <w:p>
@@ -2192,7 +2136,7 @@
         <w:spacing w:after="60"/>
       </w:pPr>
       <w:r>
-        <w:t>模型调用受服务负载影响：课堂试用前应准备人工诊疗回退、重试与失败提示，并对模型版本、调用时间和返回状态留痕。</w:t>
+        <w:t>模型服务尚未通过三类故障的外部有效性复验：一次输出含未经教师参数支持的数值结论，后两次返回429繁忙。平台会阻止不合格内容下发并转人工待办；自动诊疗作为正式课堂依赖前，须经真实模型复测和教师复核验证。</w:t>
       </w:r>
     </w:p>
     <w:p>
@@ -2201,12 +2145,12 @@
         <w:spacing w:after="60"/>
       </w:pPr>
       <w:r>
-        <w:t>申报书中的全课程覆盖、六件课件、三件完整案例、教学视频和对照班指标尚未全部完成，应作为后续建设和结项补证项。</w:t>
+        <w:t>申报书要求的真实课堂数据、至少3件七要素案例、20—30分钟教学视频、对照班指标和学院审查记录尚未形成。六件独立原理课件已建成，仍须任课教师确认与本班实验设备的一致性。</w:t>
       </w:r>
     </w:p>
     <w:p>
       <w:r>
-        <w:t>建议按“权限与发布门禁—三类故障课堂试用—真实数据复核—成果材料补齐”的顺序推进。每一轮试用结束后由教师核对有效参与编号数、教师确认完成数、验证记录和学生反馈，再更新统计和总结报告。</w:t>
+        <w:t>上线后先用演示班完成师生流程联调；真实班级开课前确认设备清单、驱动接线、实验参数、量规、学院审查记录及异地网络可用性。每轮使用后再按有效学习编号、教师确认完成和实际验证记录更新统计。</w:t>
       </w:r>
     </w:p>
     <w:p>
@@ -2219,7 +2163,7 @@
     </w:p>
     <w:p>
       <w:r>
-        <w:t>截至本报告日期，平台已经形成可演示、可审核、可记录和可回溯的课堂试用原型，三类典型故障的教师复核流程、三级任务框架、脱敏、版本控制、统计口径和响应式界面已完成验证。平台与申报书的核心建设方向相符，但全课程覆盖、六件可视化课件、完整七要素案例、教学视频以及真实课堂成效仍需补证。后续只有在教师完成实验配置、模型服务恢复并取得真实课堂记录后，才可将“试用准备结果”更新为“项目实施成效”。</w:t>
+        <w:t>截至2026年9月25日，平台的八实验指导、六件原理课件、三类故障教师复核流程、权限与版本控制、匿名学习卡、统计口径和真实8051汇编/数字信号仿真均通过相应工程检查；公开入口可访问并已完成实验五远程运行冒烟。平台可以开展受控演示与人工复核试用。由于真实GLM请求未通过本轮可用性检查、本班板卡及驱动尚未确认，且没有真实课堂成效数据，不能表述为申报项目已经结项或八项实物实验已完成等效仿真。</w:t>
       </w:r>
     </w:p>
     <w:p>
@@ -2506,7 +2450,7 @@
     <w:sectPr>
       <w:headerReference w:type="default" r:id="rId9"/>
       <w:footerReference w:type="default" r:id="rId10"/>
-      <w:pgSz w:w="12240" w:h="15840"/>
+      <w:pgSz w:w="11906" w:h="16838"/>
       <w:pgMar w:top="1247" w:right="1247" w:bottom="1134" w:left="1417" w:header="720" w:footer="720" w:gutter="0"/>
       <w:cols w:space="720"/>
       <w:docGrid w:linePitch="360"/>
@@ -2528,7 +2472,7 @@
         <w:color w:val="6E6E6E"/>
         <w:sz w:val="16"/>
       </w:rPr>
-      <w:t>课堂试用版　｜　2026年9月20日</w:t>
+      <w:t>正式上线前核验　｜　2026年9月25日</w:t>
     </w:r>
   </w:p>
 </w:ftr>
@@ -2547,7 +2491,7 @@
         <w:color w:val="6E6E6E"/>
         <w:sz w:val="16"/>
       </w:rPr>
-      <w:t>微控制器个性化实践教学平台建设与验证报告</w:t>
+      <w:t>虚拟工程师平台建设与验证报告</w:t>
     </w:r>
   </w:p>
 </w:hdr>

</xml_diff>